<commit_message>
Add PDFs and full READMEs to Section 6
Co-Authored-By: Claude Opus 5.5 <noreply@anthropic.com>
</commit_message>
<xml_diff>
--- a/Section 6 - Academic Coursework/IT295 CompTIA Project+ Cert Prep/module3-business-case-gatorware/IT295_Module3_Business_Case_Portfolio_Justin_Martin.docx
+++ b/Section 6 - Academic Coursework/IT295 CompTIA Project+ Cert Prep/module3-business-case-gatorware/IT295_Module3_Business_Case_Portfolio_Justin_Martin.docx
@@ -49,7 +49,7 @@
                 <w:sz w:val="19"/>
                 <w:szCs w:val="19"/>
               </w:rPr>
-              <w:t xml:space="preserve">IT 249  |  MODULE 3  |  BUSINESS CASE</w:t>
+              <w:t xml:space="preserve">IT 295  |  MODULE 3  |  BUSINESS CASE</w:t>
             </w:r>
           </w:p>
           <w:p>
@@ -201,7 +201,7 @@
                 <w:sz w:val="21"/>
                 <w:szCs w:val="21"/>
               </w:rPr>
-              <w:t xml:space="preserve">IT249</w:t>
+              <w:t xml:space="preserve">IT295</w:t>
             </w:r>
           </w:p>
         </w:tc>
@@ -4914,7 +4914,7 @@
         <w:sz w:val="16"/>
         <w:szCs w:val="16"/>
       </w:rPr>
-      <w:t xml:space="preserve">	Justin Martin  |  IT249 Module 3</w:t>
+      <w:t xml:space="preserve">	Justin Martin  |  IT295 Module 3</w:t>
     </w:r>
   </w:p>
 </w:hdr>

</xml_diff>